<commit_message>
empecé a preparar la clase del 30 de abril
</commit_message>
<xml_diff>
--- a/3_paciales/2_parcial/parcial_2_5.docx
+++ b/3_paciales/2_parcial/parcial_2_5.docx
@@ -11,7 +11,13 @@
     </w:p>
     <w:p>
       <w:r>
-        <w:t xml:space="preserve">Parcial 2. 16 de abril de 2026. </w:t>
+        <w:t xml:space="preserve">Parcial 2. </w:t>
+      </w:r>
+      <w:r>
+        <w:t>24</w:t>
+      </w:r>
+      <w:r>
+        <w:t xml:space="preserve"> de abril de 2026. </w:t>
       </w:r>
     </w:p>
     <w:p>
@@ -23,7 +29,7 @@
     <w:p>
       <w:r>
         <w:pict w14:anchorId="06AA6F2D">
-          <v:rect id="_x0000_i1073" style="width:0;height:1.5pt" o:hralign="center" o:hrstd="t" o:hrnoshade="t" o:hr="t" fillcolor="gray" stroked="f"/>
+          <v:rect id="_x0000_i1025" style="width:0;height:1.5pt" o:hralign="center" o:hrstd="t" o:hrnoshade="t" o:hr="t" fillcolor="gray" stroked="f"/>
         </w:pict>
       </w:r>
     </w:p>
@@ -69,7 +75,7 @@
     <w:p>
       <w:r>
         <w:pict w14:anchorId="5377CF2A">
-          <v:rect id="_x0000_i1074" style="width:0;height:1.5pt" o:hralign="center" o:hrstd="t" o:hrnoshade="t" o:hr="t" fillcolor="gray" stroked="f"/>
+          <v:rect id="_x0000_i1026" style="width:0;height:1.5pt" o:hralign="center" o:hrstd="t" o:hrnoshade="t" o:hr="t" fillcolor="gray" stroked="f"/>
         </w:pict>
       </w:r>
     </w:p>
@@ -96,23 +102,7 @@
         </w:numPr>
       </w:pPr>
       <w:r>
-        <w:t xml:space="preserve">El examen debe ser resuelto en Python puro. No se permite el uso de librerías como </w:t>
-      </w:r>
-      <w:proofErr w:type="spellStart"/>
-      <w:r>
-        <w:t>NumPy</w:t>
-      </w:r>
-      <w:proofErr w:type="spellEnd"/>
-      <w:r>
-        <w:t xml:space="preserve"> o </w:t>
-      </w:r>
-      <w:proofErr w:type="spellStart"/>
-      <w:r>
-        <w:t>SciPy</w:t>
-      </w:r>
-      <w:proofErr w:type="spellEnd"/>
-      <w:r>
-        <w:t>.</w:t>
+        <w:t>El examen debe ser resuelto en Python puro. No se permite el uso de librerías como NumPy o SciPy.</w:t>
       </w:r>
     </w:p>
     <w:p>
@@ -140,7 +130,7 @@
     <w:p>
       <w:r>
         <w:pict w14:anchorId="3653527A">
-          <v:rect id="_x0000_i1075" style="width:0;height:1.5pt" o:hralign="center" o:hrstd="t" o:hrnoshade="t" o:hr="t" fillcolor="gray" stroked="f"/>
+          <v:rect id="_x0000_i1027" style="width:0;height:1.5pt" o:hralign="center" o:hrstd="t" o:hrnoshade="t" o:hr="t" fillcolor="gray" stroked="f"/>
         </w:pict>
       </w:r>
     </w:p>
@@ -250,7 +240,7 @@
     <w:p>
       <w:r>
         <w:pict w14:anchorId="358FF274">
-          <v:rect id="_x0000_i1076" style="width:0;height:1.5pt" o:hralign="center" o:hrstd="t" o:hrnoshade="t" o:hr="t" fillcolor="gray" stroked="f"/>
+          <v:rect id="_x0000_i1028" style="width:0;height:1.5pt" o:hralign="center" o:hrstd="t" o:hrnoshade="t" o:hr="t" fillcolor="gray" stroked="f"/>
         </w:pict>
       </w:r>
     </w:p>
@@ -475,83 +465,31 @@
           <w:bCs/>
         </w:rPr>
         <w:lastRenderedPageBreak/>
-        <w:t>2. Cálculo: Aproximación del Logaritmo (</w:t>
-      </w:r>
-      <w:proofErr w:type="spellStart"/>
-      <w:r>
-        <w:rPr>
-          <w:b/>
-          <w:bCs/>
-        </w:rPr>
-        <w:t>Loops</w:t>
-      </w:r>
-      <w:proofErr w:type="spellEnd"/>
-      <w:r>
-        <w:rPr>
-          <w:b/>
-          <w:bCs/>
-        </w:rPr>
-        <w:t>)</w:t>
+        <w:t>2. Cálculo: Aproximación del Logaritmo (Loops)</w:t>
       </w:r>
     </w:p>
     <w:p>
       <w:r>
         <w:t xml:space="preserve">La función </w:t>
       </w:r>
-      <w:proofErr w:type="spellStart"/>
-      <w:proofErr w:type="gramStart"/>
-      <w:r>
-        <w:rPr>
-          <w:b/>
-          <w:bCs/>
-        </w:rPr>
-        <w:t>ln</w:t>
-      </w:r>
-      <w:proofErr w:type="spellEnd"/>
-      <w:r>
-        <w:rPr>
-          <w:b/>
-          <w:bCs/>
-        </w:rPr>
-        <w:t>(</w:t>
-      </w:r>
-      <w:proofErr w:type="gramEnd"/>
-      <w:r>
-        <w:rPr>
-          <w:b/>
-          <w:bCs/>
-        </w:rPr>
-        <w:t>1 + x)</w:t>
+      <w:r>
+        <w:rPr>
+          <w:b/>
+          <w:bCs/>
+        </w:rPr>
+        <w:t>ln(1 + x)</w:t>
       </w:r>
       <w:r>
         <w:t xml:space="preserve"> se puede aproximar mediante la serie de Mercator para |x| &lt; 1:</w:t>
       </w:r>
     </w:p>
     <w:p>
-      <w:proofErr w:type="spellStart"/>
-      <w:proofErr w:type="gramStart"/>
-      <w:r>
-        <w:rPr>
-          <w:b/>
-          <w:bCs/>
-        </w:rPr>
-        <w:t>ln</w:t>
-      </w:r>
-      <w:proofErr w:type="spellEnd"/>
-      <w:r>
-        <w:rPr>
-          <w:b/>
-          <w:bCs/>
-        </w:rPr>
-        <w:t>(</w:t>
-      </w:r>
-      <w:proofErr w:type="gramEnd"/>
-      <w:r>
-        <w:rPr>
-          <w:b/>
-          <w:bCs/>
-        </w:rPr>
-        <w:t>1 + x) = x - (x^2 / 2) + (x^3 / 3) - (x^4 / 4) + ...</w:t>
+      <w:r>
+        <w:rPr>
+          <w:b/>
+          <w:bCs/>
+        </w:rPr>
+        <w:t>ln(1 + x) = x - (x^2 / 2) + (x^3 / 3) - (x^4 / 4) + ...</w:t>
       </w:r>
     </w:p>
     <w:p>
@@ -610,7 +548,7 @@
     <w:p>
       <w:r>
         <w:pict w14:anchorId="6E5527B3">
-          <v:rect id="_x0000_i1077" style="width:0;height:1.5pt" o:hralign="center" o:hrstd="t" o:hrnoshade="t" o:hr="t" fillcolor="gray" stroked="f"/>
+          <v:rect id="_x0000_i1029" style="width:0;height:1.5pt" o:hralign="center" o:hrstd="t" o:hrnoshade="t" o:hr="t" fillcolor="gray" stroked="f"/>
         </w:pict>
       </w:r>
     </w:p>
@@ -771,23 +709,7 @@
           <w:bCs/>
         </w:rPr>
         <w:lastRenderedPageBreak/>
-        <w:t>3. Álgebra Lineal: Producto Punto y Ortogonalidad (</w:t>
-      </w:r>
-      <w:proofErr w:type="spellStart"/>
-      <w:r>
-        <w:rPr>
-          <w:b/>
-          <w:bCs/>
-        </w:rPr>
-        <w:t>Loops</w:t>
-      </w:r>
-      <w:proofErr w:type="spellEnd"/>
-      <w:r>
-        <w:rPr>
-          <w:b/>
-          <w:bCs/>
-        </w:rPr>
-        <w:t xml:space="preserve"> y Listas)</w:t>
+        <w:t>3. Álgebra Lineal: Producto Punto y Ortogonalidad (Loops y Listas)</w:t>
       </w:r>
     </w:p>
     <w:p>
@@ -826,7 +748,6 @@
       <w:r>
         <w:t xml:space="preserve"> entre ambos usando un único bucle </w:t>
       </w:r>
-      <w:proofErr w:type="spellStart"/>
       <w:r>
         <w:rPr>
           <w:b/>
@@ -834,7 +755,6 @@
         </w:rPr>
         <w:t>for</w:t>
       </w:r>
-      <w:proofErr w:type="spellEnd"/>
       <w:r>
         <w:t>.</w:t>
       </w:r>
@@ -878,21 +798,13 @@
         <w:t>condicional</w:t>
       </w:r>
       <w:r>
-        <w:t xml:space="preserve"> para determinar si los vectores son ortogonales (producto punto cercano a 0) o si el ángulo entre ellos es agudo </w:t>
-      </w:r>
-      <w:proofErr w:type="spellStart"/>
-      <w:r>
-        <w:t>o</w:t>
-      </w:r>
-      <w:proofErr w:type="spellEnd"/>
-      <w:r>
-        <w:t xml:space="preserve"> obtuso (basado en el signo del producto punto).</w:t>
+        <w:t xml:space="preserve"> para determinar si los vectores son ortogonales (producto punto cercano a 0) o si el ángulo entre ellos es agudo o obtuso (basado en el signo del producto punto).</w:t>
       </w:r>
     </w:p>
     <w:p>
       <w:r>
         <w:pict w14:anchorId="53E0FCE1">
-          <v:rect id="_x0000_i1078" style="width:0;height:1.5pt" o:hralign="center" o:hrstd="t" o:hrnoshade="t" o:hr="t" fillcolor="gray" stroked="f"/>
+          <v:rect id="_x0000_i1030" style="width:0;height:1.5pt" o:hralign="center" o:hrstd="t" o:hrnoshade="t" o:hr="t" fillcolor="gray" stroked="f"/>
         </w:pict>
       </w:r>
     </w:p>
@@ -1050,31 +962,14 @@
     </w:p>
     <w:p>
       <w:r>
-        <w:t xml:space="preserve">Para que un algoritmo de Machine </w:t>
-      </w:r>
-      <w:proofErr w:type="spellStart"/>
-      <w:r>
-        <w:t>Learning</w:t>
-      </w:r>
-      <w:proofErr w:type="spellEnd"/>
-      <w:r>
-        <w:t xml:space="preserve"> funcione bien, los datos deben estar en la misma escala. Diseñe una función llamada </w:t>
-      </w:r>
-      <w:proofErr w:type="spellStart"/>
-      <w:r>
-        <w:rPr>
-          <w:b/>
-          <w:bCs/>
-        </w:rPr>
-        <w:t>escalar_min_max</w:t>
-      </w:r>
-      <w:proofErr w:type="spellEnd"/>
-      <w:r>
-        <w:rPr>
-          <w:b/>
-          <w:bCs/>
-        </w:rPr>
-        <w:t>(datos)</w:t>
+        <w:t xml:space="preserve">Para que un algoritmo de Machine Learning funcione bien, los datos deben estar en la misma escala. Diseñe una función llamada </w:t>
+      </w:r>
+      <w:r>
+        <w:rPr>
+          <w:b/>
+          <w:bCs/>
+        </w:rPr>
+        <w:t>escalar_min_max(datos)</w:t>
       </w:r>
       <w:r>
         <w:t xml:space="preserve"> que:</w:t>
@@ -1112,37 +1007,12 @@
       <w:r>
         <w:t xml:space="preserve">Transforme cada dato x usando la fórmula: </w:t>
       </w:r>
-      <w:proofErr w:type="spellStart"/>
-      <w:r>
-        <w:rPr>
-          <w:b/>
-          <w:bCs/>
-        </w:rPr>
-        <w:t>x_nuevo</w:t>
-      </w:r>
-      <w:proofErr w:type="spellEnd"/>
-      <w:r>
-        <w:rPr>
-          <w:b/>
-          <w:bCs/>
-        </w:rPr>
-        <w:t xml:space="preserve"> = (x - min) / (</w:t>
-      </w:r>
-      <w:proofErr w:type="spellStart"/>
-      <w:r>
-        <w:rPr>
-          <w:b/>
-          <w:bCs/>
-        </w:rPr>
-        <w:t>max</w:t>
-      </w:r>
-      <w:proofErr w:type="spellEnd"/>
-      <w:r>
-        <w:rPr>
-          <w:b/>
-          <w:bCs/>
-        </w:rPr>
-        <w:t xml:space="preserve"> - min)</w:t>
+      <w:r>
+        <w:rPr>
+          <w:b/>
+          <w:bCs/>
+        </w:rPr>
+        <w:t>x_nuevo = (x - min) / (max - min)</w:t>
       </w:r>
       <w:r>
         <w:t>.</w:t>
@@ -1173,7 +1043,7 @@
     <w:p>
       <w:r>
         <w:pict w14:anchorId="79523181">
-          <v:rect id="_x0000_i1079" style="width:0;height:1.5pt" o:hralign="center" o:hrstd="t" o:hrnoshade="t" o:hr="t" fillcolor="gray" stroked="f"/>
+          <v:rect id="_x0000_i1031" style="width:0;height:1.5pt" o:hralign="center" o:hrstd="t" o:hrnoshade="t" o:hr="t" fillcolor="gray" stroked="f"/>
         </w:pict>
       </w:r>
     </w:p>
@@ -1325,29 +1195,12 @@
       <w:r>
         <w:t xml:space="preserve">El método de Newton es una técnica para hallar raíces mediante la fórmula: </w:t>
       </w:r>
-      <w:proofErr w:type="spellStart"/>
-      <w:r>
-        <w:rPr>
-          <w:b/>
-          <w:bCs/>
-        </w:rPr>
-        <w:t>x_nuevo</w:t>
-      </w:r>
-      <w:proofErr w:type="spellEnd"/>
-      <w:r>
-        <w:rPr>
-          <w:b/>
-          <w:bCs/>
-        </w:rPr>
-        <w:t xml:space="preserve"> = </w:t>
-      </w:r>
-      <w:proofErr w:type="spellStart"/>
-      <w:r>
-        <w:rPr>
-          <w:b/>
-          <w:bCs/>
-        </w:rPr>
-        <w:t>x</w:t>
+      <w:r>
+        <w:rPr>
+          <w:b/>
+          <w:bCs/>
+        </w:rPr>
+        <w:t>x_nuevo = x</w:t>
       </w:r>
       <w:r>
         <w:rPr>
@@ -1356,60 +1209,12 @@
         </w:rPr>
         <w:t>_anterior</w:t>
       </w:r>
-      <w:proofErr w:type="spellEnd"/>
-      <w:r>
-        <w:rPr>
-          <w:b/>
-          <w:bCs/>
-        </w:rPr>
-        <w:t xml:space="preserve"> - f(</w:t>
-      </w:r>
-      <w:proofErr w:type="spellStart"/>
-      <w:r>
-        <w:rPr>
-          <w:b/>
-          <w:bCs/>
-        </w:rPr>
-        <w:t>x</w:t>
-      </w:r>
-      <w:r>
-        <w:rPr>
-          <w:b/>
-          <w:bCs/>
-        </w:rPr>
-        <w:t>_</w:t>
-      </w:r>
-      <w:proofErr w:type="gramStart"/>
-      <w:r>
-        <w:rPr>
-          <w:b/>
-          <w:bCs/>
-        </w:rPr>
-        <w:t>anterior</w:t>
-      </w:r>
-      <w:proofErr w:type="spellEnd"/>
-      <w:r>
-        <w:rPr>
-          <w:b/>
-          <w:bCs/>
-        </w:rPr>
-        <w:t>)/</w:t>
-      </w:r>
-      <w:proofErr w:type="gramEnd"/>
-      <w:r>
-        <w:rPr>
-          <w:b/>
-          <w:bCs/>
-        </w:rPr>
-        <w:t>f'(</w:t>
-      </w:r>
-      <w:proofErr w:type="spellStart"/>
-      <w:r>
-        <w:rPr>
-          <w:b/>
-          <w:bCs/>
-        </w:rPr>
-        <w:t>x</w:t>
+      <w:r>
+        <w:rPr>
+          <w:b/>
+          <w:bCs/>
+        </w:rPr>
+        <w:t xml:space="preserve"> - f(x</w:t>
       </w:r>
       <w:r>
         <w:rPr>
@@ -1418,7 +1223,20 @@
         </w:rPr>
         <w:t>_anterior</w:t>
       </w:r>
-      <w:proofErr w:type="spellEnd"/>
+      <w:r>
+        <w:rPr>
+          <w:b/>
+          <w:bCs/>
+        </w:rPr>
+        <w:t>)/f'(x</w:t>
+      </w:r>
+      <w:r>
+        <w:rPr>
+          <w:b/>
+          <w:bCs/>
+        </w:rPr>
+        <w:t>_anterior</w:t>
+      </w:r>
       <w:r>
         <w:rPr>
           <w:b/>
@@ -1464,15 +1282,7 @@
         </w:numPr>
       </w:pPr>
       <w:r>
-        <w:t xml:space="preserve">Cree una función </w:t>
-      </w:r>
-      <w:proofErr w:type="spellStart"/>
-      <w:r>
-        <w:t>df</w:t>
-      </w:r>
-      <w:proofErr w:type="spellEnd"/>
-      <w:r>
-        <w:t>(x) que retorne la derivada 2x.</w:t>
+        <w:t>Cree una función df(x) que retorne la derivada 2x.</w:t>
       </w:r>
     </w:p>
     <w:p>
@@ -1510,7 +1320,7 @@
     <w:p>
       <w:r>
         <w:pict w14:anchorId="61422609">
-          <v:rect id="_x0000_i1080" style="width:0;height:1.5pt" o:hralign="center" o:hrstd="t" o:hrnoshade="t" o:hr="t" fillcolor="gray" stroked="f"/>
+          <v:rect id="_x0000_i1032" style="width:0;height:1.5pt" o:hralign="center" o:hrstd="t" o:hrnoshade="t" o:hr="t" fillcolor="gray" stroked="f"/>
         </w:pict>
       </w:r>
     </w:p>
@@ -2865,6 +2675,7 @@
   <w:style w:type="character" w:default="1" w:styleId="Fuentedeprrafopredeter">
     <w:name w:val="Default Paragraph Font"/>
     <w:uiPriority w:val="1"/>
+    <w:semiHidden/>
     <w:unhideWhenUsed/>
   </w:style>
   <w:style w:type="table" w:default="1" w:styleId="Tablanormal">

</xml_diff>